<commit_message>
Fill in contact details on care manager handout
Co-Authored-By: Claude Opus 5.5 <noreply@anthropic.com>
Claude-Session: https://claude.ai/code/session_01Rdbx23RfnTPsKsVMbyaZUY
</commit_message>
<xml_diff>
--- a/相談一覧_ケアマネ向け.docx
+++ b/相談一覧_ケアマネ向け.docx
@@ -1250,7 +1250,7 @@
                 <w:sz w:val="19"/>
                 <w:szCs w:val="19"/>
               </w:rPr>
-              <w:t xml:space="preserve">【氏名】　ファイナンシャルプランナー</w:t>
+              <w:t xml:space="preserve">ファイナンシャルプランナー　小野 健汰</w:t>
             </w:r>
           </w:p>
           <w:p>
@@ -1288,7 +1288,7 @@
                 <w:sz w:val="18"/>
                 <w:szCs w:val="18"/>
               </w:rPr>
-              <w:t xml:space="preserve">電話：</w:t>
+              <w:t xml:space="preserve">電話：080-1659-3872</w:t>
             </w:r>
           </w:p>
           <w:p>
@@ -1301,7 +1301,7 @@
                 <w:sz w:val="18"/>
                 <w:szCs w:val="18"/>
               </w:rPr>
-              <w:t xml:space="preserve">メール：</w:t>
+              <w:t xml:space="preserve">メール：k-ono@gyl.jp</w:t>
             </w:r>
           </w:p>
           <w:p>

</xml_diff>

<commit_message>
Remove consultation fee line from care manager handout
Co-Authored-By: Claude Opus 5.5 <noreply@anthropic.com>
Claude-Session: https://claude.ai/code/session_01Rdbx23RfnTPsKsVMbyaZUY
</commit_message>
<xml_diff>
--- a/相談一覧_ケアマネ向け.docx
+++ b/相談一覧_ケアマネ向け.docx
@@ -1293,7 +1293,7 @@
           </w:p>
           <w:p>
             <w:pPr>
-              <w:spacing w:after="30" w:before="0" w:line="276"/>
+              <w:spacing w:after="0" w:before="0" w:line="276"/>
             </w:pPr>
             <w:r>
               <w:rPr>
@@ -1302,19 +1302,6 @@
                 <w:szCs w:val="18"/>
               </w:rPr>
               <w:t xml:space="preserve">メール：k-ono@gyl.jp</w:t>
-            </w:r>
-          </w:p>
-          <w:p>
-            <w:pPr>
-              <w:spacing w:after="0" w:before="0" w:line="276"/>
-            </w:pPr>
-            <w:r>
-              <w:rPr>
-                <w:rFonts w:ascii="Yu Gothic" w:cs="Yu Gothic" w:eastAsia="Yu Gothic" w:hAnsi="Yu Gothic"/>
-                <w:sz w:val="18"/>
-                <w:szCs w:val="18"/>
-              </w:rPr>
-              <w:t xml:space="preserve">相談料など：</w:t>
             </w:r>
           </w:p>
         </w:tc>

</xml_diff>